<commit_message>
applications batch 3: rows 60-79 (18 new document sets, 2 relinks)
New documents for Insulet (7), GE HealthCare, Leonardo DRS, Moderna, Vertex, Astranis, Collins Jamestown, MIT Lincoln Lab Microfab, Draper Materials, and Entegris Billerica (5). Rows 63 and 67 duplicate earlier postings (GE Vernova Nuclear, Applied Materials Gloucester) so they link to the earlier files. Also regenerates batch 2 letters to drop repeated sentences. All files checked at one page in Word.

Co-Authored-By: Claude Sonnet 5 <noreply@anthropic.com>
</commit_message>
<xml_diff>
--- a/applications/Hamza_Ouriour_Cover_Letter_Collins_CertificationCoop.docx
+++ b/applications/Hamza_Ouriour_Cover_Letter_Collins_CertificationCoop.docx
@@ -145,19 +145,6 @@
           <w:szCs w:val="22"/>
         </w:rPr>
         <w:t xml:space="preserve">At Starship Robotics I designed and validated sensor-actuator electronics through iterative hardware testing. I analyzed sensor data to find failure patterns and wrote reports that guided hardware and software changes.</w:t>
-      </w:r>
-    </w:p>
-    <w:p>
-      <w:pPr>
-        <w:spacing w:after="180"/>
-      </w:pPr>
-      <w:r>
-        <w:rPr>
-          <w:rFonts w:ascii="Calibri" w:cs="Calibri" w:eastAsia="Calibri" w:hAnsi="Calibri"/>
-          <w:sz w:val="22"/>
-          <w:szCs w:val="22"/>
-        </w:rPr>
-        <w:t xml:space="preserve">At NASA Johnson Space Center I built and integrated hardware for the Lunar Terrain Vehicle Ground Test Unit. I managed procurement, revision cycles, and component assembly across more than six subsystems and kept configuration records traceable.</w:t>
       </w:r>
     </w:p>
     <w:p>

</xml_diff>